<commit_message>
Add 3 area pages (Cottonwood Heights, Herriman, Riverton), 3 blog posts (hail damage, emergency leak, insurance claims), Google Ads conversion tracking
</commit_message>
<xml_diff>
--- a/Digital RealEstate SOPs/SOP-00 Playbook Overview.docx
+++ b/Digital RealEstate SOPs/SOP-00 Playbook Overview.docx
@@ -2805,7 +2805,73 @@
                 <w:sz w:val="20"/>
                 <w:szCs w:val="20"/>
               </w:rPr>
-              <w:t xml:space="preserve">Automation: form submission to Google Sheets plus SMS plus email alert.</w:t>
+              <w:t xml:space="preserve">Optional SMS and email alerts for lead notifications. Not used in Astro builds (Formspree handles form delivery).</w:t>
+            </w:r>
+          </w:p>
+        </w:tc>
+      </w:tr>
+      <w:tr>
+        <w:tc>
+          <w:tcPr>
+            <w:tcW w:type="dxa" w:w="2600"/>
+            <w:tcBorders>
+              <w:top w:val="single" w:color="CCCCCC" w:sz="1"/>
+              <w:left w:val="single" w:color="CCCCCC" w:sz="1"/>
+              <w:bottom w:val="single" w:color="CCCCCC" w:sz="1"/>
+              <w:right w:val="single" w:color="CCCCCC" w:sz="1"/>
+            </w:tcBorders>
+            <w:shd w:fill="FFFFFF" w:val="clear"/>
+            <w:tcMar>
+              <w:top w:type="dxa" w:w="100"/>
+              <w:left w:type="dxa" w:w="140"/>
+              <w:bottom w:type="dxa" w:w="100"/>
+              <w:right w:type="dxa" w:w="140"/>
+            </w:tcMar>
+            <w:vAlign w:val="center"/>
+          </w:tcPr>
+          <w:p>
+            <w:r>
+              <w:rPr>
+                <w:rFonts w:ascii="Arial" w:cs="Arial" w:eastAsia="Arial" w:hAnsi="Arial"/>
+                <w:b w:val="false"/>
+                <w:bCs w:val="false"/>
+                <w:color w:val="000000"/>
+                <w:sz w:val="20"/>
+                <w:szCs w:val="20"/>
+              </w:rPr>
+              <w:t xml:space="preserve">Formspree</w:t>
+            </w:r>
+          </w:p>
+        </w:tc>
+        <w:tc>
+          <w:tcPr>
+            <w:tcW w:type="dxa" w:w="6760"/>
+            <w:tcBorders>
+              <w:top w:val="single" w:color="CCCCCC" w:sz="1"/>
+              <w:left w:val="single" w:color="CCCCCC" w:sz="1"/>
+              <w:bottom w:val="single" w:color="CCCCCC" w:sz="1"/>
+              <w:right w:val="single" w:color="CCCCCC" w:sz="1"/>
+            </w:tcBorders>
+            <w:shd w:fill="FFFFFF" w:val="clear"/>
+            <w:tcMar>
+              <w:top w:type="dxa" w:w="100"/>
+              <w:left w:type="dxa" w:w="140"/>
+              <w:bottom w:type="dxa" w:w="100"/>
+              <w:right w:type="dxa" w:w="140"/>
+            </w:tcMar>
+            <w:vAlign w:val="center"/>
+          </w:tcPr>
+          <w:p>
+            <w:r>
+              <w:rPr>
+                <w:rFonts w:ascii="Arial" w:cs="Arial" w:eastAsia="Arial" w:hAnsi="Arial"/>
+                <w:b w:val="false"/>
+                <w:bCs w:val="false"/>
+                <w:color w:val="000000"/>
+                <w:sz w:val="20"/>
+                <w:szCs w:val="20"/>
+              </w:rPr>
+              <w:t xml:space="preserve">Lead form handler for Astro sites. Captures submissions and sends email notifications. Free tier covers the pilot.</w:t>
             </w:r>
           </w:p>
         </w:tc>

</xml_diff>

<commit_message>
fix: upgrade CI to Node 22 to match lockfile
</commit_message>
<xml_diff>
--- a/Digital RealEstate SOPs/SOP-00 Playbook Overview.docx
+++ b/Digital RealEstate SOPs/SOP-00 Playbook Overview.docx
@@ -2805,73 +2805,7 @@
                 <w:sz w:val="20"/>
                 <w:szCs w:val="20"/>
               </w:rPr>
-              <w:t xml:space="preserve">Optional SMS and email alerts for lead notifications. Not used in Astro builds (Formspree handles form delivery).</w:t>
-            </w:r>
-          </w:p>
-        </w:tc>
-      </w:tr>
-      <w:tr>
-        <w:tc>
-          <w:tcPr>
-            <w:tcW w:type="dxa" w:w="2600"/>
-            <w:tcBorders>
-              <w:top w:val="single" w:color="CCCCCC" w:sz="1"/>
-              <w:left w:val="single" w:color="CCCCCC" w:sz="1"/>
-              <w:bottom w:val="single" w:color="CCCCCC" w:sz="1"/>
-              <w:right w:val="single" w:color="CCCCCC" w:sz="1"/>
-            </w:tcBorders>
-            <w:shd w:fill="FFFFFF" w:val="clear"/>
-            <w:tcMar>
-              <w:top w:type="dxa" w:w="100"/>
-              <w:left w:type="dxa" w:w="140"/>
-              <w:bottom w:type="dxa" w:w="100"/>
-              <w:right w:type="dxa" w:w="140"/>
-            </w:tcMar>
-            <w:vAlign w:val="center"/>
-          </w:tcPr>
-          <w:p>
-            <w:r>
-              <w:rPr>
-                <w:rFonts w:ascii="Arial" w:cs="Arial" w:eastAsia="Arial" w:hAnsi="Arial"/>
-                <w:b w:val="false"/>
-                <w:bCs w:val="false"/>
-                <w:color w:val="000000"/>
-                <w:sz w:val="20"/>
-                <w:szCs w:val="20"/>
-              </w:rPr>
-              <w:t xml:space="preserve">Formspree</w:t>
-            </w:r>
-          </w:p>
-        </w:tc>
-        <w:tc>
-          <w:tcPr>
-            <w:tcW w:type="dxa" w:w="6760"/>
-            <w:tcBorders>
-              <w:top w:val="single" w:color="CCCCCC" w:sz="1"/>
-              <w:left w:val="single" w:color="CCCCCC" w:sz="1"/>
-              <w:bottom w:val="single" w:color="CCCCCC" w:sz="1"/>
-              <w:right w:val="single" w:color="CCCCCC" w:sz="1"/>
-            </w:tcBorders>
-            <w:shd w:fill="FFFFFF" w:val="clear"/>
-            <w:tcMar>
-              <w:top w:type="dxa" w:w="100"/>
-              <w:left w:type="dxa" w:w="140"/>
-              <w:bottom w:type="dxa" w:w="100"/>
-              <w:right w:type="dxa" w:w="140"/>
-            </w:tcMar>
-            <w:vAlign w:val="center"/>
-          </w:tcPr>
-          <w:p>
-            <w:r>
-              <w:rPr>
-                <w:rFonts w:ascii="Arial" w:cs="Arial" w:eastAsia="Arial" w:hAnsi="Arial"/>
-                <w:b w:val="false"/>
-                <w:bCs w:val="false"/>
-                <w:color w:val="000000"/>
-                <w:sz w:val="20"/>
-                <w:szCs w:val="20"/>
-              </w:rPr>
-              <w:t xml:space="preserve">Lead form handler for Astro sites. Captures submissions and sends email notifications. Free tier covers the pilot.</w:t>
+              <w:t xml:space="preserve">Automation: form submission to Google Sheets plus SMS plus email alert.</w:t>
             </w:r>
           </w:p>
         </w:tc>

</xml_diff>